<commit_message>
fix: correct Figure 1 pipeline schematic layout/arrow-routing bug
The 3x3 grid always laid boxes out left-to-right per row, but the arrow
code assumed a boustrophedon (snake) flow -- so the row-2 connectors
(step 4 -> 5 -> 6) pointed at the wrong box edges and rendered hidden
behind the boxes. Fixed the layout to genuinely alternate column order
per row, redrew all connectors as full arrows, and grouped the 9 steps
into 3 colour-coded phases with labels so the pipeline's structure reads
at a glance. Regenerated the manuscript and submission package with the
corrected figure; added the zenodo_upload/ staging folder (not previously
tracked).

Co-Authored-By: Claude Sonnet 5 <noreply@anthropic.com>
</commit_message>
<xml_diff>
--- a/manuscript/Beilstein_Perspective_Methods_Pipeline_Monreal_Hernandez_et_al.docx
+++ b/manuscript/Beilstein_Perspective_Methods_Pipeline_Monreal_Hernandez_et_al.docx
@@ -347,7 +347,7 @@
       <w:r>
         <w:drawing>
           <wp:inline xmlns:a="http://schemas.openxmlformats.org/drawingml/2006/main" xmlns:pic="http://schemas.openxmlformats.org/drawingml/2006/picture">
-            <wp:extent cx="5669280" cy="4711092"/>
+            <wp:extent cx="5669280" cy="7186653"/>
             <wp:docPr id="1" name="Picture 1"/>
             <wp:cNvGraphicFramePr>
               <a:graphicFrameLocks noChangeAspect="1"/>
@@ -368,7 +368,7 @@
                   <pic:spPr>
                     <a:xfrm>
                       <a:off x="0" y="0"/>
-                      <a:ext cx="5669280" cy="4711092"/>
+                      <a:ext cx="5669280" cy="7186653"/>
                     </a:xfrm>
                     <a:prstGeom prst="rect"/>
                   </pic:spPr>

</xml_diff>